<commit_message>
Team doc: add Part 4 (spec gap closure) to combined 18-July update
Co-Authored-By: Claude Fable 5 <noreply@anthropic.com>
</commit_message>
<xml_diff>
--- a/docs/Platform_Update_Proximate_18_July_2026.docx
+++ b/docs/Platform_Update_Proximate_18_July_2026.docx
@@ -31,7 +31,7 @@
           <w:sz w:val="22"/>
           <w:szCs w:val="22"/>
         </w:rPr>
-        <w:t xml:space="preserve">One day, one story: the consolidated UI/UX redesign the team specified went fully live in the morning across seventeen production deployments; an independent validation of that delivery scored it 8.8/10 with two priority-one findings; both were fixed, verified live and re-validated the same day (revised score 9.4/10); and a new read-only observer capability was added for safe leadership access to production. This note replaces the two separate updates circulated earlier today.</w:t>
+        <w:t xml:space="preserve">One day, one story: the consolidated UI/UX redesign the team specified went fully live in the morning across seventeen production deployments; an independent validation of that delivery scored it 8.8/10 with two priority-one findings; both were fixed, verified live and re-validated the same day (revised score 9.4/10); a new read-only observer capability was added for safe leadership access to production; and every remaining open item from the redesign spec was then closed in a final evening wave. This note replaces the two separate updates circulated earlier today.</w:t>
       </w:r>
     </w:p>
     <w:p>
@@ -487,37 +487,173 @@
           <w:sz w:val="26"/>
           <w:szCs w:val="26"/>
         </w:rPr>
-        <w:t xml:space="preserve">What we deliberately did not change</w:t>
-      </w:r>
-    </w:p>
-    <w:p>
-      <w:pPr>
-        <w:pStyle w:val="ListParagraph"/>
-        <w:numPr>
-          <w:ilvl w:val="0"/>
-          <w:numId w:val="2"/>
-        </w:numPr>
-        <w:spacing w:after="80"/>
-      </w:pPr>
-      <w:r>
-        <w:rPr>
-          <w:rFonts w:ascii="Arial" w:cs="Arial" w:eastAsia="Arial" w:hAnsi="Arial"/>
-          <w:b/>
-          <w:bCs/>
-          <w:color w:val="222222"/>
-          <w:sz w:val="22"/>
-          <w:szCs w:val="22"/>
-        </w:rPr>
-        <w:t xml:space="preserve">No business logic, no permissions, no records. </w:t>
-      </w:r>
-      <w:r>
-        <w:rPr>
-          <w:rFonts w:ascii="Arial" w:cs="Arial" w:eastAsia="Arial" w:hAnsi="Arial"/>
-          <w:color w:val="222222"/>
-          <w:sz w:val="22"/>
-          <w:szCs w:val="22"/>
-        </w:rPr>
-        <w:t xml:space="preserve">The redesign was presentation only: every workflow, approval rule, RBAC gate and audit behaviour works exactly as before. The Blue Nile round, QA’s flagged test disbursement, and the validator’s re-validation artifacts were all left exactly as they were.</w:t>
+        <w:t xml:space="preserve">Part 4 — Every remaining spec item, closed</w:t>
+      </w:r>
+    </w:p>
+    <w:p>
+      <w:pPr>
+        <w:spacing w:after="120"/>
+      </w:pPr>
+      <w:r>
+        <w:rPr>
+          <w:rFonts w:ascii="Arial" w:cs="Arial" w:eastAsia="Arial" w:hAnsi="Arial"/>
+          <w:b w:val="false"/>
+          <w:bCs w:val="false"/>
+          <w:color w:val="222222"/>
+          <w:sz w:val="22"/>
+          <w:szCs w:val="22"/>
+        </w:rPr>
+        <w:t xml:space="preserve">A final evening wave addressed everything still open from the redesign document, so the spec is now delivered in full rather than "except for". All items verified live on production.</w:t>
+      </w:r>
+    </w:p>
+    <w:p>
+      <w:pPr>
+        <w:pStyle w:val="ListParagraph"/>
+        <w:numPr>
+          <w:ilvl w:val="0"/>
+          <w:numId w:val="2"/>
+        </w:numPr>
+        <w:spacing w:after="80"/>
+      </w:pPr>
+      <w:r>
+        <w:rPr>
+          <w:rFonts w:ascii="Arial" w:cs="Arial" w:eastAsia="Arial" w:hAnsi="Arial"/>
+          <w:b/>
+          <w:bCs/>
+          <w:color w:val="222222"/>
+          <w:sz w:val="22"/>
+          <w:szCs w:val="22"/>
+        </w:rPr>
+        <w:t xml:space="preserve">Settings hub. </w:t>
+      </w:r>
+      <w:r>
+        <w:rPr>
+          <w:rFonts w:ascii="Arial" w:cs="Arial" w:eastAsia="Arial" w:hAnsi="Arial"/>
+          <w:color w:val="222222"/>
+          <w:sz w:val="22"/>
+          <w:szCs w:val="22"/>
+        </w:rPr>
+        <w:t xml:space="preserve">The single Settings landing page the spec sketched now exists: profile, language, theme and low-bandwidth controls grouped with links to notification and security settings, plus role-appropriate extras (marketplace tools appear only on Kuja; administration links only for admins). Every Settings link in the sidebar, on every tenant, now lands here.</w:t>
+      </w:r>
+    </w:p>
+    <w:p>
+      <w:pPr>
+        <w:pStyle w:val="ListParagraph"/>
+        <w:numPr>
+          <w:ilvl w:val="0"/>
+          <w:numId w:val="2"/>
+        </w:numPr>
+        <w:spacing w:after="80"/>
+      </w:pPr>
+      <w:r>
+        <w:rPr>
+          <w:rFonts w:ascii="Arial" w:cs="Arial" w:eastAsia="Arial" w:hAnsi="Arial"/>
+          <w:b/>
+          <w:bCs/>
+          <w:color w:val="222222"/>
+          <w:sz w:val="22"/>
+          <w:szCs w:val="22"/>
+        </w:rPr>
+        <w:t xml:space="preserve">Mobile bottom navigation. </w:t>
+      </w:r>
+      <w:r>
+        <w:rPr>
+          <w:rFonts w:ascii="Arial" w:cs="Arial" w:eastAsia="Arial" w:hAnsi="Arial"/>
+          <w:color w:val="222222"/>
+          <w:sz w:val="22"/>
+          <w:szCs w:val="22"/>
+        </w:rPr>
+        <w:t xml:space="preserve">The Proximate team now gets the spec’s suggested phone navigation — Home, Rounds, Partners, Disbursements, More — visible only to the Oversight Body persona on phone-width screens. Donors and community endorsers keep their simpler flows unchanged.</w:t>
+      </w:r>
+    </w:p>
+    <w:p>
+      <w:pPr>
+        <w:pStyle w:val="ListParagraph"/>
+        <w:numPr>
+          <w:ilvl w:val="0"/>
+          <w:numId w:val="2"/>
+        </w:numPr>
+        <w:spacing w:after="80"/>
+      </w:pPr>
+      <w:r>
+        <w:rPr>
+          <w:rFonts w:ascii="Arial" w:cs="Arial" w:eastAsia="Arial" w:hAnsi="Arial"/>
+          <w:b/>
+          <w:bCs/>
+          <w:color w:val="222222"/>
+          <w:sz w:val="22"/>
+          <w:szCs w:val="22"/>
+        </w:rPr>
+        <w:t xml:space="preserve">Saved filters. </w:t>
+      </w:r>
+      <w:r>
+        <w:rPr>
+          <w:rFonts w:ascii="Arial" w:cs="Arial" w:eastAsia="Arial" w:hAnsi="Arial"/>
+          <w:color w:val="222222"/>
+          <w:sz w:val="22"/>
+          <w:szCs w:val="22"/>
+        </w:rPr>
+        <w:t xml:space="preserve">On the Partners register, a filtered view (status and search) can be saved as a named chip and re-applied with one tap. Saved on the device, up to six.</w:t>
+      </w:r>
+    </w:p>
+    <w:p>
+      <w:pPr>
+        <w:pStyle w:val="ListParagraph"/>
+        <w:numPr>
+          <w:ilvl w:val="0"/>
+          <w:numId w:val="2"/>
+        </w:numPr>
+        <w:spacing w:after="80"/>
+      </w:pPr>
+      <w:r>
+        <w:rPr>
+          <w:rFonts w:ascii="Arial" w:cs="Arial" w:eastAsia="Arial" w:hAnsi="Arial"/>
+          <w:b/>
+          <w:bCs/>
+          <w:color w:val="222222"/>
+          <w:sz w:val="22"/>
+          <w:szCs w:val="22"/>
+        </w:rPr>
+        <w:t xml:space="preserve">Previous / next record navigation. </w:t>
+      </w:r>
+      <w:r>
+        <w:rPr>
+          <w:rFonts w:ascii="Arial" w:cs="Arial" w:eastAsia="Arial" w:hAnsi="Arial"/>
+          <w:color w:val="222222"/>
+          <w:sz w:val="22"/>
+          <w:szCs w:val="22"/>
+        </w:rPr>
+        <w:t xml:space="preserve">Reviewers walking the partner register can now step to the previous or next partner directly from a partner’s page, in the register’s order, keeping the tab they were reading.</w:t>
+      </w:r>
+    </w:p>
+    <w:p>
+      <w:pPr>
+        <w:pStyle w:val="ListParagraph"/>
+        <w:numPr>
+          <w:ilvl w:val="0"/>
+          <w:numId w:val="2"/>
+        </w:numPr>
+        <w:spacing w:after="80"/>
+      </w:pPr>
+      <w:r>
+        <w:rPr>
+          <w:rFonts w:ascii="Arial" w:cs="Arial" w:eastAsia="Arial" w:hAnsi="Arial"/>
+          <w:b/>
+          <w:bCs/>
+          <w:color w:val="222222"/>
+          <w:sz w:val="22"/>
+          <w:szCs w:val="22"/>
+        </w:rPr>
+        <w:t xml:space="preserve">Tablet verified. </w:t>
+      </w:r>
+      <w:r>
+        <w:rPr>
+          <w:rFonts w:ascii="Arial" w:cs="Arial" w:eastAsia="Arial" w:hAnsi="Arial"/>
+          <w:color w:val="222222"/>
+          <w:sz w:val="22"/>
+          <w:szCs w:val="22"/>
+        </w:rPr>
+        <w:t xml:space="preserve">The one missing acceptance-criteria pass ran on both tablet orientations (768×1024 and 1024×768) across all redesigned screens plus the new Settings hub: forty of forty checks passed with zero overflow and zero errors, with screenshot evidence per screen. The tablet sweep now runs as part of the standing verification set.</w:t>
       </w:r>
     </w:p>
     <w:p>
@@ -533,6 +669,52 @@
           <w:sz w:val="26"/>
           <w:szCs w:val="26"/>
         </w:rPr>
+        <w:t xml:space="preserve">What we deliberately did not change</w:t>
+      </w:r>
+    </w:p>
+    <w:p>
+      <w:pPr>
+        <w:pStyle w:val="ListParagraph"/>
+        <w:numPr>
+          <w:ilvl w:val="0"/>
+          <w:numId w:val="2"/>
+        </w:numPr>
+        <w:spacing w:after="80"/>
+      </w:pPr>
+      <w:r>
+        <w:rPr>
+          <w:rFonts w:ascii="Arial" w:cs="Arial" w:eastAsia="Arial" w:hAnsi="Arial"/>
+          <w:b/>
+          <w:bCs/>
+          <w:color w:val="222222"/>
+          <w:sz w:val="22"/>
+          <w:szCs w:val="22"/>
+        </w:rPr>
+        <w:t xml:space="preserve">No business logic, no permissions, no records. </w:t>
+      </w:r>
+      <w:r>
+        <w:rPr>
+          <w:rFonts w:ascii="Arial" w:cs="Arial" w:eastAsia="Arial" w:hAnsi="Arial"/>
+          <w:color w:val="222222"/>
+          <w:sz w:val="22"/>
+          <w:szCs w:val="22"/>
+        </w:rPr>
+        <w:t xml:space="preserve">The redesign was presentation only: every workflow, approval rule, RBAC gate and audit behaviour works exactly as before. The Blue Nile round, QA’s flagged test disbursement, and the validator’s re-validation artifacts were all left exactly as they were.</w:t>
+      </w:r>
+    </w:p>
+    <w:p>
+      <w:pPr>
+        <w:pStyle w:val="Heading1"/>
+      </w:pPr>
+      <w:r>
+        <w:rPr>
+          <w:rFonts w:ascii="Arial" w:cs="Arial" w:eastAsia="Arial" w:hAnsi="Arial"/>
+          <w:b/>
+          <w:bCs/>
+          <w:color w:val="FC5810"/>
+          <w:sz w:val="26"/>
+          <w:szCs w:val="26"/>
+        </w:rPr>
         <w:t xml:space="preserve">Still open (tracked, unchanged)</w:t>
       </w:r>
     </w:p>
@@ -623,7 +805,7 @@
           <w:sz w:val="22"/>
           <w:szCs w:val="22"/>
         </w:rPr>
-        <w:t xml:space="preserve">free SAM.gov key on Railway; QCF temporary password change on first login; optional single Settings hub page.</w:t>
+        <w:t xml:space="preserve">free SAM.gov key on Railway; QCF temporary password change on first login.</w:t>
       </w:r>
     </w:p>
     <w:p>
@@ -637,7 +819,7 @@
           <w:sz w:val="18"/>
           <w:szCs w:val="18"/>
         </w:rPr>
-        <w:t xml:space="preserve">Production builds covered: 77c91ca0f (QA-18 + flagged-report rule), 2b79ba4fe (design system), ff6f65bf5 (shell), 409f27335 / c7ff60ee5 / dde4ce0c8 / c8fe52d39 / 957ae5791 / 9d9e682e3 / 513d30094 / 59d4fb8f6 (working screens), a257e27eb / adcb07591 / f518ecc97 (governance surfaces), 131044a7d (validation P1s + audit labels + test hardening), e542ba716 (whats-new backend tenant guard), a9a1a8684 (read-only observer accounts) — all live and verified on production. Release gate: 96 automated checks, green. Prepared 18 July 2026; supersedes the two separate updates from earlier today.</w:t>
+        <w:t xml:space="preserve">Production builds covered: 77c91ca0f (QA-18 + flagged-report rule), 2b79ba4fe (design system), ff6f65bf5 (shell), 409f27335 / c7ff60ee5 / dde4ce0c8 / c8fe52d39 / 957ae5791 / 9d9e682e3 / 513d30094 / 59d4fb8f6 (working screens), a257e27eb / adcb07591 / f518ecc97 (governance surfaces), 131044a7d (validation P1s + audit labels + test hardening), e542ba716 (whats-new backend tenant guard), a9a1a8684 (read-only observer accounts), 356ccf372 (settings hub + mobile bottom nav + saved filters + prev/next + tablet sweep) — all live and verified on production. Release gate: 96 automated checks, green. Prepared 18 July 2026; supersedes the two separate updates from earlier today.</w:t>
       </w:r>
     </w:p>
     <w:sectPr>

</xml_diff>